<commit_message>
EU-GMP: Word-Dateien neu erzeugt
</commit_message>
<xml_diff>
--- a/eu-gmp-rag/ausgabe/Anhang 10 Herstellung von Dosieraerosolen zur Inhalation.docx
+++ b/eu-gmp-rag/ausgabe/Anhang 10 Herstellung von Dosieraerosolen zur Inhalation.docx
@@ -16,40 +16,9 @@
       </w:r>
     </w:p>
     <w:p>
-      <w:r>
-        <w:rPr>
-          <w:b/>
-        </w:rPr>
-        <w:t>Tabelle (zeilenweise wiedergegeben):</w:t>
-      </w:r>
-    </w:p>
-    <w:p>
       <w:pPr>
-        <w:pStyle w:val="ListBullet"/>
+        <w:pStyle w:val="Heading2"/>
       </w:pPr>
-      <w:r>
-        <w:t>EG-GMP Leitfaden, Anhang 10:: Ergänzende Leitlinie für die Herstellung von Aerosolpräparaten in.</w:t>
-      </w:r>
-    </w:p>
-    <w:p>
-      <w:pPr>
-        <w:pStyle w:val="ListBullet"/>
-      </w:pPr>
-      <w:r>
-        <w:t>EG-GMP Leitfaden, Anhang 10:: Sprühflaschen mit vorgegebener Dosiervorrichtung zur Inhalation.</w:t>
-      </w:r>
-    </w:p>
-    <w:p>
-      <w:r>
-        <w:t>Anhang 10 wurde als Anlage 2 zur Bekanntmachung des Bundesministeriums für Gesundheit vom</w:t>
-      </w:r>
-    </w:p>
-    <w:p>
-      <w:r>
-        <w:t>2. Januar 1992 in deutscher Sprache veröffentlicht (BAnz. Nr. 18 vom 28. Januar 1992).</w:t>
-      </w:r>
-    </w:p>
-    <w:p>
       <w:r>
         <w:t>Grundsätze</w:t>
       </w:r>
@@ -60,6 +29,9 @@
       </w:r>
     </w:p>
     <w:p>
+      <w:pPr>
+        <w:pStyle w:val="Heading2"/>
+      </w:pPr>
       <w:r>
         <w:t>Allgemeines</w:t>
       </w:r>
@@ -80,6 +52,9 @@
       </w:r>
     </w:p>
     <w:p>
+      <w:pPr>
+        <w:pStyle w:val="Heading2"/>
+      </w:pPr>
       <w:r>
         <w:t>Räumlichkeiten und Ausrüstung</w:t>
       </w:r>
@@ -95,6 +70,9 @@
       </w:r>
     </w:p>
     <w:p>
+      <w:pPr>
+        <w:pStyle w:val="Heading2"/>
+      </w:pPr>
       <w:r>
         <w:t>Herstellung und Qualitätskontrolle</w:t>
       </w:r>

</xml_diff>